<commit_message>
Cap nhat README va ho so bao cao ban giao
README bo sung huong dan verify.ps1, pytest.ini va CI. Cap nhat hai DOCX
bao cao va script finalize_documents.py sinh tai lieu.

Co-Authored-By: Claude Fable 5 <noreply@anthropic.com>
</commit_message>
<xml_diff>
--- a/HoSo_BaoCao_ParkingAI/04_BaoCao/BaoCao_DoAn_ParkingAI.docx
+++ b/HoSo_BaoCao_ParkingAI/04_BaoCao/BaoCao_DoAn_ParkingAI.docx
@@ -71,6 +71,7 @@
       <w:tr>
         <w:trPr>
           <w:tblHeader w:val="true"/>
+          <w:cantSplit w:val="true"/>
         </w:trPr>
         <w:tc>
           <w:tcPr>
@@ -128,6 +129,9 @@
         </w:tc>
       </w:tr>
       <w:tr>
+        <w:trPr>
+          <w:cantSplit w:val="true"/>
+        </w:trPr>
         <w:tc>
           <w:tcPr>
             <w:tcW w:type="dxa" w:w="2700"/>
@@ -178,6 +182,9 @@
         </w:tc>
       </w:tr>
       <w:tr>
+        <w:trPr>
+          <w:cantSplit w:val="true"/>
+        </w:trPr>
         <w:tc>
           <w:tcPr>
             <w:tcW w:type="dxa" w:w="2700"/>
@@ -222,12 +229,15 @@
                 <w:rFonts w:ascii="Calibri" w:hAnsi="Calibri"/>
                 <w:sz w:val="20"/>
               </w:rPr>
-              <w:t>18/08/2026</w:t>
+              <w:t>23/08/2026</w:t>
             </w:r>
           </w:p>
         </w:tc>
       </w:tr>
       <w:tr>
+        <w:trPr>
+          <w:cantSplit w:val="true"/>
+        </w:trPr>
         <w:tc>
           <w:tcPr>
             <w:tcW w:type="dxa" w:w="2700"/>
@@ -278,6 +288,9 @@
         </w:tc>
       </w:tr>
       <w:tr>
+        <w:trPr>
+          <w:cantSplit w:val="true"/>
+        </w:trPr>
         <w:tc>
           <w:tcPr>
             <w:tcW w:type="dxa" w:w="2700"/>
@@ -322,12 +335,15 @@
                 <w:rFonts w:ascii="Calibri" w:hAnsi="Calibri"/>
                 <w:sz w:val="20"/>
               </w:rPr>
-              <w:t>........................................................</w:t>
+              <w:t>Lý Trường Sơn; Lâm Duy Lập</w:t>
             </w:r>
           </w:p>
         </w:tc>
       </w:tr>
       <w:tr>
+        <w:trPr>
+          <w:cantSplit w:val="true"/>
+        </w:trPr>
         <w:tc>
           <w:tcPr>
             <w:tcW w:type="dxa" w:w="2700"/>
@@ -372,7 +388,7 @@
                 <w:rFonts w:ascii="Calibri" w:hAnsi="Calibri"/>
                 <w:sz w:val="20"/>
               </w:rPr>
-              <w:t>........................................................</w:t>
+              <w:t>Chưa cung cấp trong hồ sơ dự án</w:t>
             </w:r>
           </w:p>
         </w:tc>
@@ -413,11 +429,8 @@
     </w:p>
     <w:p>
       <w:pPr>
-        <w:pStyle w:val="ListNumber"/>
-        <w:numPr>
-          <w:ilvl w:val="0"/>
-          <w:numId w:val="10"/>
-        </w:numPr>
+        <w:spacing w:after="60"/>
+        <w:ind w:left="360"/>
       </w:pPr>
       <w:r>
         <w:t>1. Tóm tắt đề tài</w:t>
@@ -425,11 +438,8 @@
     </w:p>
     <w:p>
       <w:pPr>
-        <w:pStyle w:val="ListNumber"/>
-        <w:numPr>
-          <w:ilvl w:val="0"/>
-          <w:numId w:val="10"/>
-        </w:numPr>
+        <w:spacing w:after="60"/>
+        <w:ind w:left="360"/>
       </w:pPr>
       <w:r>
         <w:t>2. Khảo sát và phân tích yêu cầu (KT1)</w:t>
@@ -437,11 +447,8 @@
     </w:p>
     <w:p>
       <w:pPr>
-        <w:pStyle w:val="ListNumber"/>
-        <w:numPr>
-          <w:ilvl w:val="0"/>
-          <w:numId w:val="10"/>
-        </w:numPr>
+        <w:spacing w:after="60"/>
+        <w:ind w:left="360"/>
       </w:pPr>
       <w:r>
         <w:t>3. Thiết kế hệ thống và UML (KT2)</w:t>
@@ -449,11 +456,8 @@
     </w:p>
     <w:p>
       <w:pPr>
-        <w:pStyle w:val="ListNumber"/>
-        <w:numPr>
-          <w:ilvl w:val="0"/>
-          <w:numId w:val="10"/>
-        </w:numPr>
+        <w:spacing w:after="60"/>
+        <w:ind w:left="360"/>
       </w:pPr>
       <w:r>
         <w:t>4. Thiết kế cơ sở dữ liệu và ERD (KT2)</w:t>
@@ -461,11 +465,8 @@
     </w:p>
     <w:p>
       <w:pPr>
-        <w:pStyle w:val="ListNumber"/>
-        <w:numPr>
-          <w:ilvl w:val="0"/>
-          <w:numId w:val="10"/>
-        </w:numPr>
+        <w:spacing w:after="60"/>
+        <w:ind w:left="360"/>
       </w:pPr>
       <w:r>
         <w:t>5. Triển khai backend</w:t>
@@ -473,11 +474,8 @@
     </w:p>
     <w:p>
       <w:pPr>
-        <w:pStyle w:val="ListNumber"/>
-        <w:numPr>
-          <w:ilvl w:val="0"/>
-          <w:numId w:val="10"/>
-        </w:numPr>
+        <w:spacing w:after="60"/>
+        <w:ind w:left="360"/>
       </w:pPr>
       <w:r>
         <w:t>6. Triển khai frontend</w:t>
@@ -485,11 +483,8 @@
     </w:p>
     <w:p>
       <w:pPr>
-        <w:pStyle w:val="ListNumber"/>
-        <w:numPr>
-          <w:ilvl w:val="0"/>
-          <w:numId w:val="10"/>
-        </w:numPr>
+        <w:spacing w:after="60"/>
+        <w:ind w:left="360"/>
       </w:pPr>
       <w:r>
         <w:t>7. Tích hợp AI</w:t>
@@ -497,11 +492,8 @@
     </w:p>
     <w:p>
       <w:pPr>
-        <w:pStyle w:val="ListNumber"/>
-        <w:numPr>
-          <w:ilvl w:val="0"/>
-          <w:numId w:val="10"/>
-        </w:numPr>
+        <w:spacing w:after="60"/>
+        <w:ind w:left="360"/>
       </w:pPr>
       <w:r>
         <w:t>8. Kiểm thử và đánh giá (KT3)</w:t>
@@ -509,11 +501,8 @@
     </w:p>
     <w:p>
       <w:pPr>
-        <w:pStyle w:val="ListNumber"/>
-        <w:numPr>
-          <w:ilvl w:val="0"/>
-          <w:numId w:val="10"/>
-        </w:numPr>
+        <w:spacing w:after="60"/>
+        <w:ind w:left="360"/>
       </w:pPr>
       <w:r>
         <w:t>9. Cài đặt và kịch bản demo</w:t>
@@ -521,11 +510,8 @@
     </w:p>
     <w:p>
       <w:pPr>
-        <w:pStyle w:val="ListNumber"/>
-        <w:numPr>
-          <w:ilvl w:val="0"/>
-          <w:numId w:val="10"/>
-        </w:numPr>
+        <w:spacing w:after="60"/>
+        <w:ind w:left="360"/>
       </w:pPr>
       <w:r>
         <w:t>10. Kết luận và hướng phát triển</w:t>
@@ -533,11 +519,8 @@
     </w:p>
     <w:p>
       <w:pPr>
-        <w:pStyle w:val="ListNumber"/>
-        <w:numPr>
-          <w:ilvl w:val="0"/>
-          <w:numId w:val="10"/>
-        </w:numPr>
+        <w:spacing w:after="60"/>
+        <w:ind w:left="360"/>
       </w:pPr>
       <w:r>
         <w:t>Phụ lục A. Ma trận truy vết yêu cầu</w:t>
@@ -562,7 +545,7 @@
           <w:color w:val="1F4D78"/>
           <w:sz w:val="21"/>
         </w:rPr>
-        <w:t xml:space="preserve">Phạm vi báo cáo: </w:t>
+        <w:t>Phạm vi báo cáo: Tài liệu phản ánh trạng thái mã nguồn và kết quả kiểm thử thực tế tại ngày 23/08/2026.</w:t>
       </w:r>
       <w:r>
         <w:rPr>
@@ -570,7 +553,6 @@
           <w:color w:val="1F2937"/>
           <w:sz w:val="21"/>
         </w:rPr>
-        <w:t>Tài liệu phản ánh trạng thái mã nguồn và kết quả kiểm thử thực tế tại ngày 18/08/2026.</w:t>
       </w:r>
     </w:p>
     <w:p>
@@ -610,7 +592,7 @@
           <w:color w:val="1F4D78"/>
           <w:sz w:val="21"/>
         </w:rPr>
-        <w:t xml:space="preserve">Kết quả chính: </w:t>
+        <w:t>Kết quả chính: Hệ thống đã có backend FastAPI, frontend React, cơ sở dữ liệu SQLite, 12 bảng nghiệp vụ, xuất Excel/PDF, nhật ký hoạt động và 79 lượt kiểm thử backend và 4 kiểm thử tiện ích frontend đều đạt.</w:t>
       </w:r>
       <w:r>
         <w:rPr>
@@ -618,7 +600,6 @@
           <w:color w:val="1F2937"/>
           <w:sz w:val="21"/>
         </w:rPr>
-        <w:t>Hệ thống đã có backend FastAPI, frontend React, cơ sở dữ liệu SQLite, 12 bảng nghiệp vụ, xuất Excel/PDF, nhật ký hoạt động và 79 kiểm thử backend đều đạt.</w:t>
       </w:r>
     </w:p>
     <w:p>
@@ -686,6 +667,7 @@
       <w:tr>
         <w:trPr>
           <w:tblHeader w:val="true"/>
+          <w:cantSplit w:val="true"/>
         </w:trPr>
         <w:tc>
           <w:tcPr>
@@ -770,6 +752,9 @@
         </w:tc>
       </w:tr>
       <w:tr>
+        <w:trPr>
+          <w:cantSplit w:val="true"/>
+        </w:trPr>
         <w:tc>
           <w:tcPr>
             <w:tcW w:type="dxa" w:w="1500"/>
@@ -844,6 +829,9 @@
         </w:tc>
       </w:tr>
       <w:tr>
+        <w:trPr>
+          <w:cantSplit w:val="true"/>
+        </w:trPr>
         <w:tc>
           <w:tcPr>
             <w:tcW w:type="dxa" w:w="1500"/>
@@ -918,6 +906,9 @@
         </w:tc>
       </w:tr>
       <w:tr>
+        <w:trPr>
+          <w:cantSplit w:val="true"/>
+        </w:trPr>
         <w:tc>
           <w:tcPr>
             <w:tcW w:type="dxa" w:w="1500"/>
@@ -992,6 +983,9 @@
         </w:tc>
       </w:tr>
       <w:tr>
+        <w:trPr>
+          <w:cantSplit w:val="true"/>
+        </w:trPr>
         <w:tc>
           <w:tcPr>
             <w:tcW w:type="dxa" w:w="1500"/>
@@ -1066,6 +1060,9 @@
         </w:tc>
       </w:tr>
       <w:tr>
+        <w:trPr>
+          <w:cantSplit w:val="true"/>
+        </w:trPr>
         <w:tc>
           <w:tcPr>
             <w:tcW w:type="dxa" w:w="1500"/>
@@ -1110,7 +1107,7 @@
                 <w:rFonts w:ascii="Calibri" w:hAnsi="Calibri"/>
                 <w:sz w:val="18"/>
               </w:rPr>
-              <w:t>pytest, ESLint, Vite build</w:t>
+              <w:t>pytest, Node test, ESLint, Vite build, GitHub Actions</w:t>
             </w:r>
           </w:p>
         </w:tc>
@@ -1134,7 +1131,7 @@
                 <w:rFonts w:ascii="Calibri" w:hAnsi="Calibri"/>
                 <w:sz w:val="18"/>
               </w:rPr>
-              <w:t>Kiểm thử và xác minh bản dựng</w:t>
+              <w:t>Kiểm thử tự động, xác minh bản dựng và kiểm tra liên tục</w:t>
             </w:r>
           </w:p>
         </w:tc>
@@ -1177,6 +1174,7 @@
       <w:tr>
         <w:trPr>
           <w:tblHeader w:val="true"/>
+          <w:cantSplit w:val="true"/>
         </w:trPr>
         <w:tc>
           <w:tcPr>
@@ -1234,6 +1232,9 @@
         </w:tc>
       </w:tr>
       <w:tr>
+        <w:trPr>
+          <w:cantSplit w:val="true"/>
+        </w:trPr>
         <w:tc>
           <w:tcPr>
             <w:tcW w:type="dxa" w:w="1900"/>
@@ -1284,6 +1285,9 @@
         </w:tc>
       </w:tr>
       <w:tr>
+        <w:trPr>
+          <w:cantSplit w:val="true"/>
+        </w:trPr>
         <w:tc>
           <w:tcPr>
             <w:tcW w:type="dxa" w:w="1900"/>
@@ -1334,6 +1338,9 @@
         </w:tc>
       </w:tr>
       <w:tr>
+        <w:trPr>
+          <w:cantSplit w:val="true"/>
+        </w:trPr>
         <w:tc>
           <w:tcPr>
             <w:tcW w:type="dxa" w:w="1900"/>
@@ -1384,6 +1391,9 @@
         </w:tc>
       </w:tr>
       <w:tr>
+        <w:trPr>
+          <w:cantSplit w:val="true"/>
+        </w:trPr>
         <w:tc>
           <w:tcPr>
             <w:tcW w:type="dxa" w:w="1900"/>
@@ -1464,6 +1474,7 @@
       <w:tr>
         <w:trPr>
           <w:tblHeader w:val="true"/>
+          <w:cantSplit w:val="true"/>
         </w:trPr>
         <w:tc>
           <w:tcPr>
@@ -1548,6 +1559,9 @@
         </w:tc>
       </w:tr>
       <w:tr>
+        <w:trPr>
+          <w:cantSplit w:val="true"/>
+        </w:trPr>
         <w:tc>
           <w:tcPr>
             <w:tcW w:type="dxa" w:w="1000"/>
@@ -1622,6 +1636,9 @@
         </w:tc>
       </w:tr>
       <w:tr>
+        <w:trPr>
+          <w:cantSplit w:val="true"/>
+        </w:trPr>
         <w:tc>
           <w:tcPr>
             <w:tcW w:type="dxa" w:w="1000"/>
@@ -1696,6 +1713,9 @@
         </w:tc>
       </w:tr>
       <w:tr>
+        <w:trPr>
+          <w:cantSplit w:val="true"/>
+        </w:trPr>
         <w:tc>
           <w:tcPr>
             <w:tcW w:type="dxa" w:w="1000"/>
@@ -1770,6 +1790,9 @@
         </w:tc>
       </w:tr>
       <w:tr>
+        <w:trPr>
+          <w:cantSplit w:val="true"/>
+        </w:trPr>
         <w:tc>
           <w:tcPr>
             <w:tcW w:type="dxa" w:w="1000"/>
@@ -1844,6 +1867,9 @@
         </w:tc>
       </w:tr>
       <w:tr>
+        <w:trPr>
+          <w:cantSplit w:val="true"/>
+        </w:trPr>
         <w:tc>
           <w:tcPr>
             <w:tcW w:type="dxa" w:w="1000"/>
@@ -1918,6 +1944,9 @@
         </w:tc>
       </w:tr>
       <w:tr>
+        <w:trPr>
+          <w:cantSplit w:val="true"/>
+        </w:trPr>
         <w:tc>
           <w:tcPr>
             <w:tcW w:type="dxa" w:w="1000"/>
@@ -1992,6 +2021,9 @@
         </w:tc>
       </w:tr>
       <w:tr>
+        <w:trPr>
+          <w:cantSplit w:val="true"/>
+        </w:trPr>
         <w:tc>
           <w:tcPr>
             <w:tcW w:type="dxa" w:w="1000"/>
@@ -2066,6 +2098,9 @@
         </w:tc>
       </w:tr>
       <w:tr>
+        <w:trPr>
+          <w:cantSplit w:val="true"/>
+        </w:trPr>
         <w:tc>
           <w:tcPr>
             <w:tcW w:type="dxa" w:w="1000"/>
@@ -2140,6 +2175,9 @@
         </w:tc>
       </w:tr>
       <w:tr>
+        <w:trPr>
+          <w:cantSplit w:val="true"/>
+        </w:trPr>
         <w:tc>
           <w:tcPr>
             <w:tcW w:type="dxa" w:w="1000"/>
@@ -2311,6 +2349,7 @@
       <w:tr>
         <w:trPr>
           <w:tblHeader w:val="true"/>
+          <w:cantSplit w:val="true"/>
         </w:trPr>
         <w:tc>
           <w:tcPr>
@@ -2368,6 +2407,9 @@
         </w:tc>
       </w:tr>
       <w:tr>
+        <w:trPr>
+          <w:cantSplit w:val="true"/>
+        </w:trPr>
         <w:tc>
           <w:tcPr>
             <w:tcW w:type="dxa" w:w="1900"/>
@@ -2418,6 +2460,9 @@
         </w:tc>
       </w:tr>
       <w:tr>
+        <w:trPr>
+          <w:cantSplit w:val="true"/>
+        </w:trPr>
         <w:tc>
           <w:tcPr>
             <w:tcW w:type="dxa" w:w="1900"/>
@@ -2468,6 +2513,9 @@
         </w:tc>
       </w:tr>
       <w:tr>
+        <w:trPr>
+          <w:cantSplit w:val="true"/>
+        </w:trPr>
         <w:tc>
           <w:tcPr>
             <w:tcW w:type="dxa" w:w="1900"/>
@@ -2518,6 +2566,9 @@
         </w:tc>
       </w:tr>
       <w:tr>
+        <w:trPr>
+          <w:cantSplit w:val="true"/>
+        </w:trPr>
         <w:tc>
           <w:tcPr>
             <w:tcW w:type="dxa" w:w="1900"/>
@@ -2568,6 +2619,9 @@
         </w:tc>
       </w:tr>
       <w:tr>
+        <w:trPr>
+          <w:cantSplit w:val="true"/>
+        </w:trPr>
         <w:tc>
           <w:tcPr>
             <w:tcW w:type="dxa" w:w="1900"/>
@@ -2719,6 +2773,7 @@
       <w:tr>
         <w:trPr>
           <w:tblHeader w:val="true"/>
+          <w:cantSplit w:val="true"/>
         </w:trPr>
         <w:tc>
           <w:tcPr>
@@ -2776,6 +2831,9 @@
         </w:tc>
       </w:tr>
       <w:tr>
+        <w:trPr>
+          <w:cantSplit w:val="true"/>
+        </w:trPr>
         <w:tc>
           <w:tcPr>
             <w:tcW w:type="dxa" w:w="1900"/>
@@ -2826,6 +2884,9 @@
         </w:tc>
       </w:tr>
       <w:tr>
+        <w:trPr>
+          <w:cantSplit w:val="true"/>
+        </w:trPr>
         <w:tc>
           <w:tcPr>
             <w:tcW w:type="dxa" w:w="1900"/>
@@ -2876,6 +2937,9 @@
         </w:tc>
       </w:tr>
       <w:tr>
+        <w:trPr>
+          <w:cantSplit w:val="true"/>
+        </w:trPr>
         <w:tc>
           <w:tcPr>
             <w:tcW w:type="dxa" w:w="1900"/>
@@ -2926,6 +2990,9 @@
         </w:tc>
       </w:tr>
       <w:tr>
+        <w:trPr>
+          <w:cantSplit w:val="true"/>
+        </w:trPr>
         <w:tc>
           <w:tcPr>
             <w:tcW w:type="dxa" w:w="1900"/>
@@ -3108,6 +3175,7 @@
       <w:tr>
         <w:trPr>
           <w:tblHeader w:val="true"/>
+          <w:cantSplit w:val="true"/>
         </w:trPr>
         <w:tc>
           <w:tcPr>
@@ -3165,6 +3233,9 @@
         </w:tc>
       </w:tr>
       <w:tr>
+        <w:trPr>
+          <w:cantSplit w:val="true"/>
+        </w:trPr>
         <w:tc>
           <w:tcPr>
             <w:tcW w:type="dxa" w:w="3000"/>
@@ -3215,6 +3286,9 @@
         </w:tc>
       </w:tr>
       <w:tr>
+        <w:trPr>
+          <w:cantSplit w:val="true"/>
+        </w:trPr>
         <w:tc>
           <w:tcPr>
             <w:tcW w:type="dxa" w:w="3000"/>
@@ -3265,6 +3339,9 @@
         </w:tc>
       </w:tr>
       <w:tr>
+        <w:trPr>
+          <w:cantSplit w:val="true"/>
+        </w:trPr>
         <w:tc>
           <w:tcPr>
             <w:tcW w:type="dxa" w:w="3000"/>
@@ -3315,6 +3392,9 @@
         </w:tc>
       </w:tr>
       <w:tr>
+        <w:trPr>
+          <w:cantSplit w:val="true"/>
+        </w:trPr>
         <w:tc>
           <w:tcPr>
             <w:tcW w:type="dxa" w:w="3000"/>
@@ -3365,6 +3445,9 @@
         </w:tc>
       </w:tr>
       <w:tr>
+        <w:trPr>
+          <w:cantSplit w:val="true"/>
+        </w:trPr>
         <w:tc>
           <w:tcPr>
             <w:tcW w:type="dxa" w:w="3000"/>
@@ -3415,6 +3498,9 @@
         </w:tc>
       </w:tr>
       <w:tr>
+        <w:trPr>
+          <w:cantSplit w:val="true"/>
+        </w:trPr>
         <w:tc>
           <w:tcPr>
             <w:tcW w:type="dxa" w:w="3000"/>
@@ -3465,6 +3551,9 @@
         </w:tc>
       </w:tr>
       <w:tr>
+        <w:trPr>
+          <w:cantSplit w:val="true"/>
+        </w:trPr>
         <w:tc>
           <w:tcPr>
             <w:tcW w:type="dxa" w:w="3000"/>
@@ -3515,6 +3604,9 @@
         </w:tc>
       </w:tr>
       <w:tr>
+        <w:trPr>
+          <w:cantSplit w:val="true"/>
+        </w:trPr>
         <w:tc>
           <w:tcPr>
             <w:tcW w:type="dxa" w:w="3000"/>
@@ -3565,6 +3657,9 @@
         </w:tc>
       </w:tr>
       <w:tr>
+        <w:trPr>
+          <w:cantSplit w:val="true"/>
+        </w:trPr>
         <w:tc>
           <w:tcPr>
             <w:tcW w:type="dxa" w:w="3000"/>
@@ -3615,6 +3710,9 @@
         </w:tc>
       </w:tr>
       <w:tr>
+        <w:trPr>
+          <w:cantSplit w:val="true"/>
+        </w:trPr>
         <w:tc>
           <w:tcPr>
             <w:tcW w:type="dxa" w:w="3000"/>
@@ -3665,6 +3763,9 @@
         </w:tc>
       </w:tr>
       <w:tr>
+        <w:trPr>
+          <w:cantSplit w:val="true"/>
+        </w:trPr>
         <w:tc>
           <w:tcPr>
             <w:tcW w:type="dxa" w:w="3000"/>
@@ -3715,6 +3816,9 @@
         </w:tc>
       </w:tr>
       <w:tr>
+        <w:trPr>
+          <w:cantSplit w:val="true"/>
+        </w:trPr>
         <w:tc>
           <w:tcPr>
             <w:tcW w:type="dxa" w:w="3000"/>
@@ -3872,6 +3976,7 @@
       <w:tr>
         <w:trPr>
           <w:tblHeader w:val="true"/>
+          <w:cantSplit w:val="true"/>
         </w:trPr>
         <w:tc>
           <w:tcPr>
@@ -3929,6 +4034,9 @@
         </w:tc>
       </w:tr>
       <w:tr>
+        <w:trPr>
+          <w:cantSplit w:val="true"/>
+        </w:trPr>
         <w:tc>
           <w:tcPr>
             <w:tcW w:type="dxa" w:w="2300"/>
@@ -3979,6 +4087,9 @@
         </w:tc>
       </w:tr>
       <w:tr>
+        <w:trPr>
+          <w:cantSplit w:val="true"/>
+        </w:trPr>
         <w:tc>
           <w:tcPr>
             <w:tcW w:type="dxa" w:w="2300"/>
@@ -4029,6 +4140,9 @@
         </w:tc>
       </w:tr>
       <w:tr>
+        <w:trPr>
+          <w:cantSplit w:val="true"/>
+        </w:trPr>
         <w:tc>
           <w:tcPr>
             <w:tcW w:type="dxa" w:w="2300"/>
@@ -4079,6 +4193,9 @@
         </w:tc>
       </w:tr>
       <w:tr>
+        <w:trPr>
+          <w:cantSplit w:val="true"/>
+        </w:trPr>
         <w:tc>
           <w:tcPr>
             <w:tcW w:type="dxa" w:w="2300"/>
@@ -4129,6 +4246,9 @@
         </w:tc>
       </w:tr>
       <w:tr>
+        <w:trPr>
+          <w:cantSplit w:val="true"/>
+        </w:trPr>
         <w:tc>
           <w:tcPr>
             <w:tcW w:type="dxa" w:w="2300"/>
@@ -4179,6 +4299,9 @@
         </w:tc>
       </w:tr>
       <w:tr>
+        <w:trPr>
+          <w:cantSplit w:val="true"/>
+        </w:trPr>
         <w:tc>
           <w:tcPr>
             <w:tcW w:type="dxa" w:w="2300"/>
@@ -4259,6 +4382,7 @@
       <w:tr>
         <w:trPr>
           <w:tblHeader w:val="true"/>
+          <w:cantSplit w:val="true"/>
         </w:trPr>
         <w:tc>
           <w:tcPr>
@@ -4343,6 +4467,9 @@
         </w:tc>
       </w:tr>
       <w:tr>
+        <w:trPr>
+          <w:cantSplit w:val="true"/>
+        </w:trPr>
         <w:tc>
           <w:tcPr>
             <w:tcW w:type="dxa" w:w="1600"/>
@@ -4417,6 +4544,9 @@
         </w:tc>
       </w:tr>
       <w:tr>
+        <w:trPr>
+          <w:cantSplit w:val="true"/>
+        </w:trPr>
         <w:tc>
           <w:tcPr>
             <w:tcW w:type="dxa" w:w="1600"/>
@@ -4491,6 +4621,9 @@
         </w:tc>
       </w:tr>
       <w:tr>
+        <w:trPr>
+          <w:cantSplit w:val="true"/>
+        </w:trPr>
         <w:tc>
           <w:tcPr>
             <w:tcW w:type="dxa" w:w="1600"/>
@@ -4565,6 +4698,9 @@
         </w:tc>
       </w:tr>
       <w:tr>
+        <w:trPr>
+          <w:cantSplit w:val="true"/>
+        </w:trPr>
         <w:tc>
           <w:tcPr>
             <w:tcW w:type="dxa" w:w="1600"/>
@@ -4639,6 +4775,9 @@
         </w:tc>
       </w:tr>
       <w:tr>
+        <w:trPr>
+          <w:cantSplit w:val="true"/>
+        </w:trPr>
         <w:tc>
           <w:tcPr>
             <w:tcW w:type="dxa" w:w="1600"/>
@@ -4713,6 +4852,9 @@
         </w:tc>
       </w:tr>
       <w:tr>
+        <w:trPr>
+          <w:cantSplit w:val="true"/>
+        </w:trPr>
         <w:tc>
           <w:tcPr>
             <w:tcW w:type="dxa" w:w="1600"/>
@@ -4853,6 +4995,7 @@
       <w:tr>
         <w:trPr>
           <w:tblHeader w:val="true"/>
+          <w:cantSplit w:val="true"/>
         </w:trPr>
         <w:tc>
           <w:tcPr>
@@ -4910,6 +5053,9 @@
         </w:tc>
       </w:tr>
       <w:tr>
+        <w:trPr>
+          <w:cantSplit w:val="true"/>
+        </w:trPr>
         <w:tc>
           <w:tcPr>
             <w:tcW w:type="dxa" w:w="2300"/>
@@ -4960,6 +5106,9 @@
         </w:tc>
       </w:tr>
       <w:tr>
+        <w:trPr>
+          <w:cantSplit w:val="true"/>
+        </w:trPr>
         <w:tc>
           <w:tcPr>
             <w:tcW w:type="dxa" w:w="2300"/>
@@ -5010,6 +5159,9 @@
         </w:tc>
       </w:tr>
       <w:tr>
+        <w:trPr>
+          <w:cantSplit w:val="true"/>
+        </w:trPr>
         <w:tc>
           <w:tcPr>
             <w:tcW w:type="dxa" w:w="2300"/>
@@ -5060,6 +5212,9 @@
         </w:tc>
       </w:tr>
       <w:tr>
+        <w:trPr>
+          <w:cantSplit w:val="true"/>
+        </w:trPr>
         <w:tc>
           <w:tcPr>
             <w:tcW w:type="dxa" w:w="2300"/>
@@ -5110,6 +5265,9 @@
         </w:tc>
       </w:tr>
       <w:tr>
+        <w:trPr>
+          <w:cantSplit w:val="true"/>
+        </w:trPr>
         <w:tc>
           <w:tcPr>
             <w:tcW w:type="dxa" w:w="2300"/>
@@ -5160,6 +5318,9 @@
         </w:tc>
       </w:tr>
       <w:tr>
+        <w:trPr>
+          <w:cantSplit w:val="true"/>
+        </w:trPr>
         <w:tc>
           <w:tcPr>
             <w:tcW w:type="dxa" w:w="2300"/>
@@ -5282,6 +5443,7 @@
       <w:tr>
         <w:trPr>
           <w:tblHeader w:val="true"/>
+          <w:cantSplit w:val="true"/>
         </w:trPr>
         <w:tc>
           <w:tcPr>
@@ -5366,6 +5528,9 @@
         </w:tc>
       </w:tr>
       <w:tr>
+        <w:trPr>
+          <w:cantSplit w:val="true"/>
+        </w:trPr>
         <w:tc>
           <w:tcPr>
             <w:tcW w:type="dxa" w:w="1900"/>
@@ -5440,6 +5605,9 @@
         </w:tc>
       </w:tr>
       <w:tr>
+        <w:trPr>
+          <w:cantSplit w:val="true"/>
+        </w:trPr>
         <w:tc>
           <w:tcPr>
             <w:tcW w:type="dxa" w:w="1900"/>
@@ -5514,6 +5682,9 @@
         </w:tc>
       </w:tr>
       <w:tr>
+        <w:trPr>
+          <w:cantSplit w:val="true"/>
+        </w:trPr>
         <w:tc>
           <w:tcPr>
             <w:tcW w:type="dxa" w:w="1900"/>
@@ -5588,6 +5759,9 @@
         </w:tc>
       </w:tr>
       <w:tr>
+        <w:trPr>
+          <w:cantSplit w:val="true"/>
+        </w:trPr>
         <w:tc>
           <w:tcPr>
             <w:tcW w:type="dxa" w:w="1900"/>
@@ -5730,6 +5904,7 @@
       <w:tr>
         <w:trPr>
           <w:tblHeader w:val="true"/>
+          <w:cantSplit w:val="true"/>
         </w:trPr>
         <w:tc>
           <w:tcPr>
@@ -5814,6 +5989,9 @@
         </w:tc>
       </w:tr>
       <w:tr>
+        <w:trPr>
+          <w:cantSplit w:val="true"/>
+        </w:trPr>
         <w:tc>
           <w:tcPr>
             <w:tcW w:type="dxa" w:w="2600"/>
@@ -5858,7 +6036,7 @@
                 <w:rFonts w:ascii="Calibri" w:hAnsi="Calibri"/>
                 <w:sz w:val="18"/>
               </w:rPr>
-              <w:t>79 passed trong 20,02 giây</w:t>
+              <w:t>79 passed, 1 warning trong 21,92 giây</w:t>
             </w:r>
           </w:p>
         </w:tc>
@@ -5888,6 +6066,9 @@
         </w:tc>
       </w:tr>
       <w:tr>
+        <w:trPr>
+          <w:cantSplit w:val="true"/>
+        </w:trPr>
         <w:tc>
           <w:tcPr>
             <w:tcW w:type="dxa" w:w="2600"/>
@@ -5908,7 +6089,7 @@
                 <w:rFonts w:ascii="Calibri" w:hAnsi="Calibri"/>
                 <w:sz w:val="18"/>
               </w:rPr>
-              <w:t>Cảnh báo</w:t>
+              <w:t>Node test frontend</w:t>
             </w:r>
           </w:p>
         </w:tc>
@@ -5932,7 +6113,7 @@
                 <w:rFonts w:ascii="Calibri" w:hAnsi="Calibri"/>
                 <w:sz w:val="18"/>
               </w:rPr>
-              <w:t>1 StarletteDeprecationWarning</w:t>
+              <w:t>4/4 kiểm thử tiện ích đạt</w:t>
             </w:r>
           </w:p>
         </w:tc>
@@ -5956,12 +6137,15 @@
                 <w:rFonts w:ascii="Calibri" w:hAnsi="Calibri"/>
                 <w:sz w:val="18"/>
               </w:rPr>
-              <w:t>THEO DÕI</w:t>
+              <w:t>ĐẠT</w:t>
             </w:r>
           </w:p>
         </w:tc>
       </w:tr>
       <w:tr>
+        <w:trPr>
+          <w:cantSplit w:val="true"/>
+        </w:trPr>
         <w:tc>
           <w:tcPr>
             <w:tcW w:type="dxa" w:w="2600"/>
@@ -6036,6 +6220,9 @@
         </w:tc>
       </w:tr>
       <w:tr>
+        <w:trPr>
+          <w:cantSplit w:val="true"/>
+        </w:trPr>
         <w:tc>
           <w:tcPr>
             <w:tcW w:type="dxa" w:w="2600"/>
@@ -6080,7 +6267,7 @@
                 <w:rFonts w:ascii="Calibri" w:hAnsi="Calibri"/>
                 <w:sz w:val="18"/>
               </w:rPr>
-              <w:t>2.104 module được xử lý</w:t>
+              <w:t>2.106 module được xử lý</w:t>
             </w:r>
           </w:p>
         </w:tc>
@@ -6105,6 +6292,41 @@
                 <w:sz w:val="18"/>
               </w:rPr>
               <w:t>ĐẠT</w:t>
+            </w:r>
+          </w:p>
+        </w:tc>
+      </w:tr>
+      <w:tr>
+        <w:trPr>
+          <w:cantSplit w:val="true"/>
+        </w:trPr>
+        <w:tc>
+          <w:tcPr>
+            <w:tcW w:type="dxa" w:w="2600"/>
+          </w:tcPr>
+          <w:p>
+            <w:r>
+              <w:t>Cảnh báo</w:t>
+            </w:r>
+          </w:p>
+        </w:tc>
+        <w:tc>
+          <w:tcPr>
+            <w:tcW w:type="dxa" w:w="4500"/>
+          </w:tcPr>
+          <w:p>
+            <w:r>
+              <w:t>1 StarletteDeprecationWarning</w:t>
+            </w:r>
+          </w:p>
+        </w:tc>
+        <w:tc>
+          <w:tcPr>
+            <w:tcW w:type="dxa" w:w="2260"/>
+          </w:tcPr>
+          <w:p>
+            <w:r>
+              <w:t>THEO DÕI</w:t>
             </w:r>
           </w:p>
         </w:tc>
@@ -6139,6 +6361,7 @@
       <w:tr>
         <w:trPr>
           <w:tblHeader w:val="true"/>
+          <w:cantSplit w:val="true"/>
         </w:trPr>
         <w:tc>
           <w:tcPr>
@@ -6196,6 +6419,9 @@
         </w:tc>
       </w:tr>
       <w:tr>
+        <w:trPr>
+          <w:cantSplit w:val="true"/>
+        </w:trPr>
         <w:tc>
           <w:tcPr>
             <w:tcW w:type="dxa" w:w="2200"/>
@@ -6246,6 +6472,9 @@
         </w:tc>
       </w:tr>
       <w:tr>
+        <w:trPr>
+          <w:cantSplit w:val="true"/>
+        </w:trPr>
         <w:tc>
           <w:tcPr>
             <w:tcW w:type="dxa" w:w="2200"/>
@@ -6296,6 +6525,9 @@
         </w:tc>
       </w:tr>
       <w:tr>
+        <w:trPr>
+          <w:cantSplit w:val="true"/>
+        </w:trPr>
         <w:tc>
           <w:tcPr>
             <w:tcW w:type="dxa" w:w="2200"/>
@@ -6346,6 +6578,9 @@
         </w:tc>
       </w:tr>
       <w:tr>
+        <w:trPr>
+          <w:cantSplit w:val="true"/>
+        </w:trPr>
         <w:tc>
           <w:tcPr>
             <w:tcW w:type="dxa" w:w="2200"/>
@@ -6396,6 +6631,9 @@
         </w:tc>
       </w:tr>
       <w:tr>
+        <w:trPr>
+          <w:cantSplit w:val="true"/>
+        </w:trPr>
         <w:tc>
           <w:tcPr>
             <w:tcW w:type="dxa" w:w="2200"/>
@@ -6446,6 +6684,9 @@
         </w:tc>
       </w:tr>
       <w:tr>
+        <w:trPr>
+          <w:cantSplit w:val="true"/>
+        </w:trPr>
         <w:tc>
           <w:tcPr>
             <w:tcW w:type="dxa" w:w="2200"/>
@@ -6604,7 +6845,7 @@
         </w:numPr>
       </w:pPr>
       <w:r>
-        <w:t>Chạy pytest, ESLint và production build trước khi bàn giao.</w:t>
+        <w:t>Chạy scripts/verify.ps1 để kiểm tra backend, frontend, ESLint và production build trước khi bàn giao.</w:t>
       </w:r>
     </w:p>
     <w:p>
@@ -6617,74 +6858,56 @@
     </w:p>
     <w:p>
       <w:pPr>
-        <w:pStyle w:val="ListNumber"/>
-        <w:numPr>
-          <w:ilvl w:val="0"/>
-          <w:numId w:val="14"/>
-        </w:numPr>
+        <w:spacing w:after="80"/>
+        <w:ind w:left="432" w:hanging="288"/>
       </w:pPr>
       <w:r>
-        <w:t>Đăng nhập manager; tạo loại xe, khu vực, vị trí và bảng giá.</w:t>
+        <w:t>1. Đăng nhập manager; tạo loại xe, khu vực, vị trí và bảng giá.</w:t>
       </w:r>
     </w:p>
     <w:p>
       <w:pPr>
-        <w:pStyle w:val="ListNumber"/>
-        <w:numPr>
-          <w:ilvl w:val="0"/>
-          <w:numId w:val="14"/>
-        </w:numPr>
+        <w:spacing w:after="80"/>
+        <w:ind w:left="432" w:hanging="288"/>
       </w:pPr>
       <w:r>
-        <w:t>Tạo khách hàng/phương tiện; thực hiện check-in và quan sát số chỗ trống giảm.</w:t>
+        <w:t>2. Tạo khách hàng/phương tiện; thực hiện check-in và quan sát số chỗ trống giảm.</w:t>
       </w:r>
     </w:p>
     <w:p>
       <w:pPr>
-        <w:pStyle w:val="ListNumber"/>
-        <w:numPr>
-          <w:ilvl w:val="0"/>
-          <w:numId w:val="14"/>
-        </w:numPr>
+        <w:spacing w:after="80"/>
+        <w:ind w:left="432" w:hanging="288"/>
       </w:pPr>
       <w:r>
-        <w:t>Thực hiện check-out; kiểm tra phí và vị trí được giải phóng.</w:t>
+        <w:t>3. Thực hiện check-out; kiểm tra phí và vị trí được giải phóng.</w:t>
       </w:r>
     </w:p>
     <w:p>
       <w:pPr>
-        <w:pStyle w:val="ListNumber"/>
-        <w:numPr>
-          <w:ilvl w:val="0"/>
-          <w:numId w:val="14"/>
-        </w:numPr>
+        <w:spacing w:after="80"/>
+        <w:ind w:left="432" w:hanging="288"/>
       </w:pPr>
       <w:r>
-        <w:t>Tạo vé tháng và lặp lại để chứng minh lượt hợp lệ được miễn phí.</w:t>
+        <w:t>4. Tạo vé tháng và lặp lại để chứng minh lượt hợp lệ được miễn phí.</w:t>
       </w:r>
     </w:p>
     <w:p>
       <w:pPr>
-        <w:pStyle w:val="ListNumber"/>
-        <w:numPr>
-          <w:ilvl w:val="0"/>
-          <w:numId w:val="14"/>
-        </w:numPr>
+        <w:spacing w:after="80"/>
+        <w:ind w:left="432" w:hanging="288"/>
       </w:pPr>
       <w:r>
-        <w:t>Mở dashboard, báo cáo, xuất Excel/PDF và xem nhật ký hoạt động.</w:t>
+        <w:t>5. Mở dashboard, báo cáo, xuất Excel/PDF và xem nhật ký hoạt động.</w:t>
       </w:r>
     </w:p>
     <w:p>
       <w:pPr>
-        <w:pStyle w:val="ListNumber"/>
-        <w:numPr>
-          <w:ilvl w:val="0"/>
-          <w:numId w:val="14"/>
-        </w:numPr>
+        <w:spacing w:after="80"/>
+        <w:ind w:left="432" w:hanging="288"/>
       </w:pPr>
       <w:r>
-        <w:t>Dùng chatbot hỏi khung giờ đông nhất, sinh báo cáo ngày/tuần và gợi ý nhân sự.</w:t>
+        <w:t>6. Dùng chatbot hỏi khung giờ đông nhất, sinh báo cáo ngày/tuần và gợi ý nhân sự.</w:t>
       </w:r>
     </w:p>
     <w:p>
@@ -6745,7 +6968,7 @@
         <w:pStyle w:val="ListBullet"/>
       </w:pPr>
       <w:r>
-        <w:t>Tăng kiểm thử giao diện đầu-cuối và đo hiệu năng API.</w:t>
+        <w:t>Mở rộng kiểm thử frontend sang component/E2E và đo hiệu năng API.</w:t>
       </w:r>
     </w:p>
     <w:p>
@@ -6778,6 +7001,7 @@
       <w:tr>
         <w:trPr>
           <w:tblHeader w:val="true"/>
+          <w:cantSplit w:val="true"/>
         </w:trPr>
         <w:tc>
           <w:tcPr>
@@ -6862,6 +7086,9 @@
         </w:tc>
       </w:tr>
       <w:tr>
+        <w:trPr>
+          <w:cantSplit w:val="true"/>
+        </w:trPr>
         <w:tc>
           <w:tcPr>
             <w:tcW w:type="dxa" w:w="900"/>
@@ -6936,6 +7163,9 @@
         </w:tc>
       </w:tr>
       <w:tr>
+        <w:trPr>
+          <w:cantSplit w:val="true"/>
+        </w:trPr>
         <w:tc>
           <w:tcPr>
             <w:tcW w:type="dxa" w:w="900"/>
@@ -7010,6 +7240,9 @@
         </w:tc>
       </w:tr>
       <w:tr>
+        <w:trPr>
+          <w:cantSplit w:val="true"/>
+        </w:trPr>
         <w:tc>
           <w:tcPr>
             <w:tcW w:type="dxa" w:w="900"/>
@@ -7084,6 +7317,9 @@
         </w:tc>
       </w:tr>
       <w:tr>
+        <w:trPr>
+          <w:cantSplit w:val="true"/>
+        </w:trPr>
         <w:tc>
           <w:tcPr>
             <w:tcW w:type="dxa" w:w="900"/>
@@ -7158,6 +7394,9 @@
         </w:tc>
       </w:tr>
       <w:tr>
+        <w:trPr>
+          <w:cantSplit w:val="true"/>
+        </w:trPr>
         <w:tc>
           <w:tcPr>
             <w:tcW w:type="dxa" w:w="900"/>
@@ -7232,6 +7471,9 @@
         </w:tc>
       </w:tr>
       <w:tr>
+        <w:trPr>
+          <w:cantSplit w:val="true"/>
+        </w:trPr>
         <w:tc>
           <w:tcPr>
             <w:tcW w:type="dxa" w:w="900"/>
@@ -7306,6 +7548,9 @@
         </w:tc>
       </w:tr>
       <w:tr>
+        <w:trPr>
+          <w:cantSplit w:val="true"/>
+        </w:trPr>
         <w:tc>
           <w:tcPr>
             <w:tcW w:type="dxa" w:w="900"/>
@@ -7380,6 +7625,9 @@
         </w:tc>
       </w:tr>
       <w:tr>
+        <w:trPr>
+          <w:cantSplit w:val="true"/>
+        </w:trPr>
         <w:tc>
           <w:tcPr>
             <w:tcW w:type="dxa" w:w="900"/>
@@ -7454,6 +7702,9 @@
         </w:tc>
       </w:tr>
       <w:tr>
+        <w:trPr>
+          <w:cantSplit w:val="true"/>
+        </w:trPr>
         <w:tc>
           <w:tcPr>
             <w:tcW w:type="dxa" w:w="900"/>
@@ -7557,6 +7808,7 @@
       <w:tr>
         <w:trPr>
           <w:tblHeader w:val="true"/>
+          <w:cantSplit w:val="true"/>
         </w:trPr>
         <w:tc>
           <w:tcPr>
@@ -7614,6 +7866,9 @@
         </w:tc>
       </w:tr>
       <w:tr>
+        <w:trPr>
+          <w:cantSplit w:val="true"/>
+        </w:trPr>
         <w:tc>
           <w:tcPr>
             <w:tcW w:type="dxa" w:w="3100"/>
@@ -7664,6 +7919,9 @@
         </w:tc>
       </w:tr>
       <w:tr>
+        <w:trPr>
+          <w:cantSplit w:val="true"/>
+        </w:trPr>
         <w:tc>
           <w:tcPr>
             <w:tcW w:type="dxa" w:w="3100"/>
@@ -7714,6 +7972,9 @@
         </w:tc>
       </w:tr>
       <w:tr>
+        <w:trPr>
+          <w:cantSplit w:val="true"/>
+        </w:trPr>
         <w:tc>
           <w:tcPr>
             <w:tcW w:type="dxa" w:w="3100"/>
@@ -7764,6 +8025,9 @@
         </w:tc>
       </w:tr>
       <w:tr>
+        <w:trPr>
+          <w:cantSplit w:val="true"/>
+        </w:trPr>
         <w:tc>
           <w:tcPr>
             <w:tcW w:type="dxa" w:w="3100"/>

</xml_diff>